<commit_message>
Dökümantasyon ve ReadMe dosyaları tamamlandı.
</commit_message>
<xml_diff>
--- a/AR_Saglik_SWOT_Analizi.docx
+++ b/AR_Saglik_SWOT_Analizi.docx
@@ -19,7 +19,7 @@
           <w:color w:val="0D6E6E"/>
           <w:sz w:val="72"/>
         </w:rPr>
-        <w:t>AR SAĞLIK PROJESİ</w:t>
+        <w:t>NEFES SAATİ</w:t>
       </w:r>
     </w:p>
     <w:p>
@@ -63,7 +63,7 @@
           <w:color w:val="4A4A6A"/>
           <w:sz w:val="22"/>
         </w:rPr>
-        <w:t>Teknoloji: React Native CLI + ViroReact + ARCore</w:t>
+        <w:t>Teknoloji: React Native CLI 0.83 + VisionCamera + ML Kit + Three.js + Firebase Firestore + @notifee</w:t>
       </w:r>
     </w:p>
     <w:p>
@@ -436,7 +436,7 @@
           <w:color w:val="1A1A2E"/>
           <w:sz w:val="22"/>
         </w:rPr>
-        <w:t>AR Sağlık Projesi, karaciğer nakli sonrası tedavi sürecindeki yaşlı hastaların ilaç yönetimini kolaylaştırmak amacıyla geliştirilmiş bir artırılmış gerçeklik (Augmented Reality - AR) tabanlı mobil uygulamadır. Uygulama, React Native CLI altyapısı üzerine inşa edilmiş olup, ViroReact kütüphanesi aracılığıyla ARCore destekli Android cihazlarda çalışmaktadır.</w:t>
+        <w:t>Nefes Saati, karaciğer nakli sonrası tedavi sürecindeki yaşlı hastaların ilaç yönetimini kolaylaştırmak amacıyla geliştirilmiş, artırılmış gerçeklik (AR) tabanlı Android mobil uygulamasıdır. React Native CLI 0.83 altyapısı üzerine inşa edilen uygulama; VisionCamera, Google ML Kit OCR, Three.js 3D model görüntüleyici, Firebase Firestore ve @notifee bildirim sistemi gibi modern teknolojileri tek çatı altında birleştirmektedir.</w:t>
       </w:r>
     </w:p>
     <w:p>
@@ -450,7 +450,7 @@
           <w:color w:val="1A1A2E"/>
           <w:sz w:val="22"/>
         </w:rPr>
-        <w:t>Karaciğer nakli sonrası hastalar, bağışıklık sistemini baskılamak ve organ reddini önlemek için ömür boyu ilaç kullanmak zorundadır. Bu ilaçların düzenli ve doğru zamanda alınması hayati önem taşır. Özellikle yaşlı hasta grubunda ilaç uyumsuzluğu (non-adherence) oranları %40-60 arasında seyretmekte ve bu durum organ reddi, hastaneye yeniden yatış ve ölüm riskini önemli ölçüde artırmaktadır.</w:t>
+        <w:t>Karaciğer nakli sonrası hastalar, bağışıklık sistemini baskılamak ve organ reddini önlemek için ömür boyu ilaç kullanmak zorundadır. Bu ilaçların düzenli ve doğru zamanda alınması hayati önem taşır. Özellikle yaşlı hasta grubunda ilaç uyumsuzluğu (non-adherence) oranları %40-60 arasında seyretmekte; bu durum organ reddi, hastaneye yeniden yatış ve ölüm riskini önemli ölçüde artırmaktadır.</w:t>
       </w:r>
     </w:p>
     <w:p>
@@ -464,7 +464,7 @@
           <w:color w:val="1A1A2E"/>
           <w:sz w:val="22"/>
         </w:rPr>
-        <w:t>Bu proje, geleneksel ilaç hatırlatma yöntemlerinin ötesine geçerek, hastanın ilaç kutusunu kameraya tutması yeterli olacak şekilde tasarlanmıştır. Uygulama ilacı tanıdığında, kutunun üzerinde 3D model gösterir ve Türkçe sesli komutla bir sonraki doz zamanını bildirir. Bu yaklaşım, teknolojiye uzak yaşlı hastalar için bile sezgisel ve kullanımı kolay bir deneyim sunmaktadır.</w:t>
+        <w:t>Uygulama; ilaç kutusu OCR tanıma, gerçek zamanlı 3D model ve Türkçe sesli bildirim özelliklerinin yanı sıra, 'İlacı Aldım' onay sistemi, haftalık rutinim ekranı, Firebase tabanlı bulut senkronizasyonu ve ebeveyn/bakıcı uzaktan takip modunu da kapsamaktadır. Tüm bu özellikler, hasta ve hasta yakınlarını tedavi sürecinde aktif birer katılımcıya dönüştürmeyi hedeflemektedir.</w:t>
       </w:r>
     </w:p>
     <w:p/>
@@ -1068,7 +1068,7 @@
           <w:color w:val="1A1A2E"/>
           <w:sz w:val="22"/>
         </w:rPr>
-        <w:t>Artırılmış Gerçeklik (AR) Teknolojisi:</w:t>
+        <w:t>OCR Tabanlı İlaç Tanıma (ML Kit):</w:t>
       </w:r>
       <w:r>
         <w:rPr>
@@ -1076,7 +1076,7 @@
           <w:color w:val="4A4A6A"/>
           <w:sz w:val="22"/>
         </w:rPr>
-        <w:t>Geleneksel ilaç takip uygulamalarından farklı olarak, hastalar ilaç kutusunu kameraya tutarak gerçek zamanlı 3D model ve sesli bilgi alabilmektedir. Bu, özellikle yaşlı ve teknolojiye uzak hastalar için son derece sezgisel bir deneyim sunar.</w:t>
+        <w:t>VisionCamera + Google ML Kit metin tanıma entegrasyonu sayesinde hastalar ilaç kutusunu kameraya tutarak saniyeler içinde tanıma yaptırabilir. OCR yaklaşımı, marker bağımlılığını ortadan kaldırarak farklı baskı serisi ve kutu kondisyonlarında çok daha güvenilir sonuçlar verir.</w:t>
       </w:r>
     </w:p>
     <w:p>
@@ -1130,7 +1130,7 @@
           <w:color w:val="1A1A2E"/>
           <w:sz w:val="22"/>
         </w:rPr>
-        <w:t>Yaşlı Dostu Arayüz Tasarımı:</w:t>
+        <w:t>Haftalık Rutinim &amp; İlaç Geçmiş Takibi:</w:t>
       </w:r>
       <w:r>
         <w:rPr>
@@ -1138,7 +1138,7 @@
           <w:color w:val="4A4A6A"/>
           <w:sz w:val="22"/>
         </w:rPr>
-        <w:t>18-24pt büyük fontlar, yüksek kontrastlı teal-turuncu renk paleti ve minimal navigasyon yapısı ile yaşlı hastaların teknolojiyle etkileşimindeki bariyerler en aza indirilmiştir. Sadece iki ekran (Ana Ekran + AR Kamera) ile karmaşıklıktan uzak bir kullanıcı deneyimi sunulur.</w:t>
+        <w:t>7 günlük grid görünümüyle alınan/kaçırılan/bekleyen her doz anlık izlenebilir. Haftalık uyum yüzdesi otomatik hesaplanır. Bu özellik, hastaların kendi tedavilerine sahip çıkmasını ve bakıcıların uzaktan takibini güçlendirir.</w:t>
       </w:r>
     </w:p>
     <w:p>
@@ -1161,7 +1161,7 @@
           <w:color w:val="1A1A2E"/>
           <w:sz w:val="22"/>
         </w:rPr>
-        <w:t>Gerçek Zamanlı Geri Sayım Sistemi:</w:t>
+        <w:t>Onaylı Doz Kaydı — 'İlacı Aldım' Sistemi:</w:t>
       </w:r>
       <w:r>
         <w:rPr>
@@ -1169,7 +1169,7 @@
           <w:color w:val="4A4A6A"/>
           <w:sz w:val="22"/>
         </w:rPr>
-        <w:t>Her ilaç için saniye bazında güncellenen geri sayım sayaçları, hastaların bir sonraki doz zamanını her an görebilmesini sağlar. Bu özellik, karaciğer nakli sonrası kritik olan ilaç uyumluluğunu (adherence) önemli ölçüde artırır.</w:t>
+        <w:t>AR overlay açılınca hasta 'İlacı Aldım' butonuna basarak dozu onaylar. Kayıt AsyncStorage ve Firebase'e eş zamanlı yazılır. Böylece hem çevrimdışı güvenlik hem de bulut senkronizasyonu sağlanır; kaçırılan dozlar geçmişte görünür kalır.</w:t>
       </w:r>
     </w:p>
     <w:p>
@@ -1192,7 +1192,7 @@
           <w:color w:val="1A1A2E"/>
           <w:sz w:val="22"/>
         </w:rPr>
-        <w:t>Kişiselleştirilebilir İlaç Saatleri:</w:t>
+        <w:t>Akıllı Bildirim &amp; Alarm Sistemi:</w:t>
       </w:r>
       <w:r>
         <w:rPr>
@@ -1200,7 +1200,7 @@
           <w:color w:val="4A4A6A"/>
           <w:sz w:val="22"/>
         </w:rPr>
-        <w:t>Varsayılan ilaç saatleri tanımlı olmakla birlikte, hasta veya hasta yakını tarafından kolayca düzenlenebilir. Bu esneklik, farklı doktorların farklı reçete protokollerine uyum sağlamayı mümkün kılar.</w:t>
+        <w:t>@notifee/react-native entegrasyonu ile her ilaç saati için günlük tekrarlayan Android bildirimleri otomatik planlanır. Kullanıcı saati güncellediğinde alarmlar anında yeniden kurulur. Sessiz saatler (23:00–07:00) korumalıdır.</w:t>
       </w:r>
     </w:p>
     <w:p>
@@ -1223,7 +1223,7 @@
           <w:color w:val="1A1A2E"/>
           <w:sz w:val="22"/>
         </w:rPr>
-        <w:t>Offline Çalışma Kapasitesi:</w:t>
+        <w:t>Firebase Firestore Bulut Senkronizasyonu:</w:t>
       </w:r>
       <w:r>
         <w:rPr>
@@ -1231,7 +1231,7 @@
           <w:color w:val="4A4A6A"/>
           <w:sz w:val="22"/>
         </w:rPr>
-        <w:t>Uygulama internet bağlantısı gerektirmeden çalışır. İlaç saatleri AsyncStorage ile cihaz üzerinde saklanır, AR tanıma ve TTS yerel olarak çalışır. Bu, yaşlı hastaların internet erişimi olmayan ortamlarda bile uygulamayı kullanabilmesini garantiler.</w:t>
+        <w:t>Uygulama 'local-first' mimarisiyle çalışır; AsyncStorage birincil, Firestore ikincil depolama katmanıdır. Ağ kesintilerinde uygulama kesintisiz çalışır; bağlantı gelince otomatik senkronizasyon başlar. Cihaz değişikliğinde veri kaybı yaşanmaz.</w:t>
       </w:r>
     </w:p>
     <w:p>
@@ -1254,7 +1254,7 @@
           <w:color w:val="1A1A2E"/>
           <w:sz w:val="22"/>
         </w:rPr>
-        <w:t>Çapraz Platform Potansiyeli:</w:t>
+        <w:t>Ebeveyn / Bakıcı Uzaktan Takip Modu:</w:t>
       </w:r>
       <w:r>
         <w:rPr>
@@ -1262,7 +1262,7 @@
           <w:color w:val="4A4A6A"/>
           <w:sz w:val="22"/>
         </w:rPr>
-        <w:t>React Native altyapısı sayesinde, şu an Android odaklı olan uygulama minimum eforla iOS platformuna da taşınabilir. Bu, gelecekte hasta erişimini önemli ölçüde genişletme potansiyeli sunar.</w:t>
+        <w:t>Hasta yakını, Rutinim ekranındaki bakıcı butonuna tıklayıp hastanın kısa ID'sini (AR-XXXX-XXXX formatı) girerek o günün tüm doz durumunu anlık görebilir. Firebase üzerinden çalışır; iki farklı cihaz arasında gerçek zamanlı takip mümkündür.</w:t>
       </w:r>
     </w:p>
     <w:p>
@@ -1285,7 +1285,7 @@
           <w:color w:val="1A1A2E"/>
           <w:sz w:val="22"/>
         </w:rPr>
-        <w:t>3D Model Entegrasyonu:</w:t>
+        <w:t>Auth-Free Cihaz Kimliği Mimarisi:</w:t>
       </w:r>
       <w:r>
         <w:rPr>
@@ -1293,7 +1293,7 @@
           <w:color w:val="4A4A6A"/>
           <w:sz w:val="22"/>
         </w:rPr>
-        <w:t>İlaç kutularının gerçekçi 3D modellemeleri (.glb formatında) AR deneyimini zenginleştirir. Hasta ilacını tanıdığında, kutunun 3D modelinin dönerek belirmesi hem bilgisel hem de görsel açıdan etkileyici bir deneyim yaratır.</w:t>
+        <w:t>Kayıt veya giriş gerektirmez. Her cihaza otomatik üretilen 8 karakterlik okunabilir ID (ör. AR-K3M8-PQ7X) kalıcı kimlik olarak kullanılır. Yaşlı hastaların şifre ve hesap yönetimiyle uğraşmaması için bilinçli alınmış kritik bir tasarım kararıdır.</w:t>
       </w:r>
     </w:p>
     <w:p>
@@ -1316,7 +1316,7 @@
           <w:color w:val="1A1A2E"/>
           <w:sz w:val="22"/>
         </w:rPr>
-        <w:t>Giriş Gerektirmeyen Yapı:</w:t>
+        <w:t>Kişiselleştirilebilir İlaç Saatleri ile Tam Entegrasyon:</w:t>
       </w:r>
       <w:r>
         <w:rPr>
@@ -1324,7 +1324,7 @@
           <w:color w:val="4A4A6A"/>
           <w:sz w:val="22"/>
         </w:rPr>
-        <w:t>Uygulama herhangi bir kayıt veya giriş süreci gerektirmez. Yaşlı hastalar uygulamayı açtığı anda kullanmaya başlayabilir. Bu, kullanım bariyerini minimuma indiren kritik bir tasarım kararıdır.</w:t>
+        <w:t>Saat düzenlendiğinde AsyncStorage, Firebase Firestore ve @notifee alarmları tek seferde güncellenir. Üç sistem arasındaki tutarlılık otomatik sağlanır; veri tutarsızlığı riski yoktur.</w:t>
       </w:r>
     </w:p>
     <w:p>
@@ -1347,7 +1347,7 @@
           <w:color w:val="1A1A2E"/>
           <w:sz w:val="22"/>
         </w:rPr>
-        <w:t>Clean Code Mimarisi:</w:t>
+        <w:t>Clean Code Mimarisi &amp; Local-First Tasarım:</w:t>
       </w:r>
       <w:r>
         <w:rPr>
@@ -1355,7 +1355,7 @@
           <w:color w:val="4A4A6A"/>
           <w:sz w:val="22"/>
         </w:rPr>
-        <w:t>Proje; constants, hooks, services, components, screens ve navigation katmanlarıyla temiz ve sürdürülebilir bir kod mimarisine sahiptir. TypeScript kullanımı tip güvenliği sağlar ve gelecekteki geliştirmeleri kolaylaştırır.</w:t>
+        <w:t>constants, hooks, services, components, screens, navigation katmanlarıyla sürdürülebilir TypeScript mimarisi. Firestore hataları sessizce yakalanır; uygulama asla Firestore'a bağımlı kalmaz. Offline-first yaklaşım, yaşlı hasta cihazlarının bağlantı kalitesi göz önüne alındığında kritik önem taşır.</w:t>
       </w:r>
     </w:p>
     <w:p>
@@ -1403,7 +1403,7 @@
           <w:color w:val="4A4A6A"/>
           <w:sz w:val="22"/>
         </w:rPr>
-        <w:t>Uygulama şu an yalnızca iki ilaç (Sandimmun Neoral ve Deltacortril) tanıyabilmektedir. Karaciğer nakli sonrası hastaların kullanabileceği Mycophenolate Mofetil (CellCept), Tacrolimus (Prograf), Ursodeoxycholic Acid gibi ek ilaçlar henüz desteklenmemektedir.</w:t>
+        <w:t>Uygulama şu an yalnızca iki ilaç (Sandimmun Neoral ve Deltacortril) tanıyabilmektedir. Karaciğer nakli sonrası hastaların kullanabileceği Tacrolimus (Prograf), Mycophenolate Mofetil (CellCept), Ursodiol gibi ek ilaçlar henüz OCR anahtar kelime listesine eklenmemiştir.</w:t>
       </w:r>
     </w:p>
     <w:p>
@@ -1426,7 +1426,7 @@
           <w:color w:val="1A1A2E"/>
           <w:sz w:val="22"/>
         </w:rPr>
-        <w:t>AR Görüntü Tanıma Hassasiyeti:</w:t>
+        <w:t>OCR Tanıma Güvenilirliği:</w:t>
       </w:r>
       <w:r>
         <w:rPr>
@@ -1434,7 +1434,7 @@
           <w:color w:val="4A4A6A"/>
           <w:sz w:val="22"/>
         </w:rPr>
-        <w:t>ViroARImageMarker tabanlı tanıma, ilaç kutusunun fiziksel durumuna (yıpranmış, buruşmuş, farklı baskı serisi) ve ortam aydınlatmasına bağlı olarak tutarsız sonuçlar verebilir. Düşük ışık koşullarında veya kutu açıldığında tanıma doğruluğu düşebilir.</w:t>
+        <w:t>ML Kit metin tanıma, ilaç kutusunun fiziksel durumuna (yıpranmış, buruşmuş, farklı dil baskısı) ve ortam aydınlatmasına bağlı olarak hatalı sonuç verebilir. Kutu üzerindeki anahtar kelime eşleştirme yöntemi, görüntü sınıflandırma modellerine kıyasla daha kırılgandır.</w:t>
       </w:r>
     </w:p>
     <w:p>
@@ -1457,7 +1457,7 @@
           <w:color w:val="1A1A2E"/>
           <w:sz w:val="22"/>
         </w:rPr>
-        <w:t>İnternet Bağımsız Güncelleme Eksikliği:</w:t>
+        <w:t>Açık Firestore Güvenlik Kuralları:</w:t>
       </w:r>
       <w:r>
         <w:rPr>
@@ -1465,7 +1465,7 @@
           <w:color w:val="4A4A6A"/>
           <w:sz w:val="22"/>
         </w:rPr>
-        <w:t>Yeni ilaçlar veya doz değişiklikleri için uygulama güncellemesi gerekir. Uzaktan ilaç listesi güncelleme mekanizması bulunmamaktadır. Bu, doktor reçete değişikliklerinde gecikmeye neden olabilir.</w:t>
+        <w:t>Mevcut güvenlik kuralları 'allow read, write: if true' şeklinde yapılandırılmıştır. Bu durum, URL'i bilen herhangi birinin koleksiyona erişebileceği anlamına gelir. Klinik ortama taşınmadan önce kural sıkılaştırması zorunludur.</w:t>
       </w:r>
     </w:p>
     <w:p>
@@ -1496,7 +1496,7 @@
           <w:color w:val="4A4A6A"/>
           <w:sz w:val="22"/>
         </w:rPr>
-        <w:t>Şu anki sürüm yalnızca Android cihazları desteklemektedir. iOS kullanan hastaların uygulamadan yararlanamaması, erişilebilirliği kısıtlar.</w:t>
+        <w:t>Şu anki sürüm yalnızca Android cihazları desteklemektedir. iOS kullanan hasta ve bakıcıların uygulamadan yararlanamaması, özellikle bakıcı takip modunun kullanımını kısıtlar.</w:t>
       </w:r>
     </w:p>
     <w:p>
@@ -1519,7 +1519,7 @@
           <w:color w:val="1A1A2E"/>
           <w:sz w:val="22"/>
         </w:rPr>
-        <w:t>Bildirim/Alarm Eksikliği:</w:t>
+        <w:t>Doktor-Hasta Entegrasyonu Yok:</w:t>
       </w:r>
       <w:r>
         <w:rPr>
@@ -1527,7 +1527,7 @@
           <w:color w:val="4A4A6A"/>
           <w:sz w:val="22"/>
         </w:rPr>
-        <w:t>Uygulama pasif bir bilgi aracıdır; proaktif olarak ilaç saati geldiğinde push notification veya alarm göndermez. Hasta uygulamayı açmadığı sürece ilaç hatırlatması almaz.</w:t>
+        <w:t>Doktor veya eczacının hastanın ilaç programını uzaktan görüntülemesi veya güncellemesi mümkün değildir. Bakıcı modu yalnızca aile üyelerini kapsamakta; klinisyen entegrasyonu bulunmamaktadır.</w:t>
       </w:r>
     </w:p>
     <w:p>
@@ -1550,7 +1550,7 @@
           <w:color w:val="1A1A2E"/>
           <w:sz w:val="22"/>
         </w:rPr>
-        <w:t>Doktor-Hasta Entegrasyonu Yok:</w:t>
+        <w:t>İlaç Etkileşimi Bilgisi Yok:</w:t>
       </w:r>
       <w:r>
         <w:rPr>
@@ -1558,7 +1558,7 @@
           <w:color w:val="4A4A6A"/>
           <w:sz w:val="22"/>
         </w:rPr>
-        <w:t>Doktor veya eczacının hastanın ilaç programını uzaktan görüntülemesi veya güncellemesi mümkün değildir. Tedavi takibi tamamen hastanın kendi sorumluluğundadır.</w:t>
+        <w:t>Uygulama ilaçlar arası etkileşim, yan etkiler veya kontraendikasyon bilgisi sunmamaktadır. Ciclosporin ile greyfurt etkileşimi gibi kritik besin-ilaç uyarıları henüz eklenmemiştir.</w:t>
       </w:r>
     </w:p>
     <w:p>
@@ -1581,7 +1581,7 @@
           <w:color w:val="1A1A2E"/>
           <w:sz w:val="22"/>
         </w:rPr>
-        <w:t>İlaç Etkileşimi Bilgisi Yok:</w:t>
+        <w:t>Erişilebilirlik Sınırlamaları:</w:t>
       </w:r>
       <w:r>
         <w:rPr>
@@ -1589,7 +1589,7 @@
           <w:color w:val="4A4A6A"/>
           <w:sz w:val="22"/>
         </w:rPr>
-        <w:t>Uygulama, ilaçlar arası etkileşim, yan etkiler veya kontraendikasyon bilgisi sunmamaktadır. Hastanın besin-ilaç etkileşimleri (örn. Ciclosporin ile greyfurt) hakkında uyarılmaması risk oluşturabilir.</w:t>
+        <w:t>Ekran okuyucu (TalkBack) uyumluluğu, renk körlüğü desteği ve motor engelli kullanıcılar için büyük dokunma alanları gibi gelişmiş erişilebilirlik özellikleri henüz implemente edilmemiştir.</w:t>
       </w:r>
     </w:p>
     <w:p>
@@ -1612,7 +1612,7 @@
           <w:color w:val="1A1A2E"/>
           <w:sz w:val="22"/>
         </w:rPr>
-        <w:t>Erişilebilirlik Sınırlamaları:</w:t>
+        <w:t>Bakıcı Modu — Tek Yönlü Veri Akışı:</w:t>
       </w:r>
       <w:r>
         <w:rPr>
@@ -1620,7 +1620,7 @@
           <w:color w:val="4A4A6A"/>
           <w:sz w:val="22"/>
         </w:rPr>
-        <w:t>Ekran okuyucu (TalkBack) uyumluluğu, renk körlüğü desteği ve motor engelli kullanıcılar için büyük dokunma alanları gibi gelişmiş erişilebilirlik özellikleri henüz implemente edilmemiştir.</w:t>
+        <w:t>Bakıcı şu an yalnızca izleyebilir; hastanın saat programını uzaktan değiştirme, mesaj gönderme veya acil uyarı tetikleme yetkisi yoktur. Ebeveyn kontrolü ileride çift yönlü yapıya dönüştürülmelidir.</w:t>
       </w:r>
     </w:p>
     <w:p>
@@ -1643,7 +1643,7 @@
           <w:color w:val="1A1A2E"/>
           <w:sz w:val="22"/>
         </w:rPr>
-        <w:t>Veri Yedekleme Yok:</w:t>
+        <w:t>Firebase Bağımlılığı ve Tek Tedarikçi Riski:</w:t>
       </w:r>
       <w:r>
         <w:rPr>
@@ -1651,7 +1651,7 @@
           <w:color w:val="4A4A6A"/>
           <w:sz w:val="22"/>
         </w:rPr>
-        <w:t>İlaç saatleri yalnızca cihaz yerel deposunda saklanır. Cihaz değişikliğinde veya uygulama silinmesinde tüm kişiselleştirilmiş veriler kaybolur.</w:t>
+        <w:t>Google'ın Firebase fiyatlandırma politikası veya servis koşullarında yapacağı değişiklikler, özellikle veri hacmi arttıkça maliyet riski oluşturabilir. Alternatif backend mimarisine geçiş planı henüz yoktur.</w:t>
       </w:r>
     </w:p>
     <w:p>
@@ -1674,7 +1674,7 @@
           <w:color w:val="1A1A2E"/>
           <w:sz w:val="22"/>
         </w:rPr>
-        <w:t>ARCore Cihaz Bağımlılığı:</w:t>
+        <w:t>İnternet Bağımsız Güncelleme Eksikliği:</w:t>
       </w:r>
       <w:r>
         <w:rPr>
@@ -1682,7 +1682,7 @@
           <w:color w:val="4A4A6A"/>
           <w:sz w:val="22"/>
         </w:rPr>
-        <w:t>AR özellikleri ARCore destekli cihaz gerektirir. Eski veya düşük seviye Android cihazlarda AR fonksiyonları çalışmayabilir, bu da yaşlı hastaların genellikle eski cihaz kullanması göz önüne alındığında önemli bir kısıtlamadır.</w:t>
+        <w:t>Yeni ilaç ekleme veya OCR anahtar kelime genişletme için uygulama güncellemesi gerekir. Uzaktan ilaç listesi güncelleme mekanizması bulunmamakta; doktor reçete değişikliklerinde gecikme yaşanabilir.</w:t>
       </w:r>
     </w:p>
     <w:p>
@@ -1722,7 +1722,7 @@
           <w:color w:val="1A1A2E"/>
           <w:sz w:val="22"/>
         </w:rPr>
-        <w:t>Sağlık Sektöründe AR Büyümesi:</w:t>
+        <w:t>Sağlık Sektöründe Dijital Dönüşüm:</w:t>
       </w:r>
       <w:r>
         <w:rPr>
@@ -1730,7 +1730,7 @@
           <w:color w:val="4A4A6A"/>
           <w:sz w:val="22"/>
         </w:rPr>
-        <w:t>Küresel artırılmış gerçeklik sağlık pazarı 2025-2030 arasında yıllık %25+ büyüme öngörülmektedir. Bu proje, bu büyüme trendinin erken dönem uygulamalarından biri olarak konumlanabilir ve yatırımcı ilgisi çekebilir.</w:t>
+        <w:t>Küresel dijital sağlık pazarı 2025-2030 arasında yıllık %25+ büyüme öngörülmektedir. Nefes Saati, AR + bulut senkronizasyonu + bakıcı takibi kombinasyonuyla bu trendin erken dönem referans uygulamalarından biri olarak konumlanabilir.</w:t>
       </w:r>
     </w:p>
     <w:p>
@@ -1753,7 +1753,7 @@
           <w:color w:val="1A1A2E"/>
           <w:sz w:val="22"/>
         </w:rPr>
-        <w:t>Hastane ve Klinik Entegrasyonları:</w:t>
+        <w:t>Hastane Taburculuk Süreci Entegrasyonu:</w:t>
       </w:r>
       <w:r>
         <w:rPr>
@@ -1761,7 +1761,7 @@
           <w:color w:val="4A4A6A"/>
           <w:sz w:val="22"/>
         </w:rPr>
-        <w:t>Karaciğer nakli merkezleri ve organ nakli koordinasyon birimleriyle işbirliği yapılarak, uygulama taburculuk sürecinin standart bir parçası haline getirilebilir. Bu, hasta uyumluluğunu %30-40 artırma potansiyeline sahiptir.</w:t>
+        <w:t>Karaciğer nakli merkezleri ve organ nakli koordinasyon birimleriyle işbirliği yapılarak uygulama taburculuk paketinin standart parçası haline getirilebilir. Bakıcı modu, hastane ile aile arasındaki iletişim köprüsünü dijitalleştirir.</w:t>
       </w:r>
     </w:p>
     <w:p>
@@ -1784,7 +1784,7 @@
           <w:color w:val="1A1A2E"/>
           <w:sz w:val="22"/>
         </w:rPr>
-        <w:t>Yapay Zeka ile İlaç Tanıma Geliştirme:</w:t>
+        <w:t>Firebase Altyapısının Genişletilmesi:</w:t>
       </w:r>
       <w:r>
         <w:rPr>
@@ -1792,7 +1792,7 @@
           <w:color w:val="4A4A6A"/>
           <w:sz w:val="22"/>
         </w:rPr>
-        <w:t>TensorFlow Lite veya Google ML Kit entegrasyonu ile görüntü tabanlı ilaç tanıma sistemi, kutunun yanı sıra tablet/kapsül bazında da tanıma yapabilir hale getirilebilir. Bu, AR marker bağımlılığını ortadan kaldırır.</w:t>
+        <w:t>Mevcut Firestore yapısı; ilaç etkileşimi kontrolü, doktor portalı, anlık bildirim (bakıcıya 'doz kaçırıldı' uyarısı) ve çok kullanıcılı aile grubu yönetimi gibi özellikler için sağlam bir temel oluşturmaktadır.</w:t>
       </w:r>
     </w:p>
     <w:p>
@@ -1815,7 +1815,7 @@
           <w:color w:val="1A1A2E"/>
           <w:sz w:val="22"/>
         </w:rPr>
-        <w:t>Çoklu Hastalık Alanlarına Genişleme:</w:t>
+        <w:t>Yapay Zeka Destekli Tanıma:</w:t>
       </w:r>
       <w:r>
         <w:rPr>
@@ -1823,7 +1823,7 @@
           <w:color w:val="4A4A6A"/>
           <w:sz w:val="22"/>
         </w:rPr>
-        <w:t>Aynı AR altyapısı; böbrek nakli, kalp nakli, diyabet, hipertansiyon, onkoloji gibi farklı hastalık alanlarına adapte edilebilir. Her hastalık için özelleştirilmiş ilaç veritabanı ve protokol eklenebilir.</w:t>
+        <w:t>Mevcut OCR altyapısı, TensorFlow Lite veya on-device ML modeli ile güçlendirilerek tablet/kapsül görüntüsünden tanıma yapılabilir hale getirilebilir. Bu, kutunun açık ya da yıpranmış olduğu durumlarda güvenilirliği önemli ölçüde artırır.</w:t>
       </w:r>
     </w:p>
     <w:p>
@@ -1846,7 +1846,7 @@
           <w:color w:val="1A1A2E"/>
           <w:sz w:val="22"/>
         </w:rPr>
-        <w:t>Giyilebilir Cihaz Entegrasyonu:</w:t>
+        <w:t>Çoklu Hastalık Alanlarına Genişleme:</w:t>
       </w:r>
       <w:r>
         <w:rPr>
@@ -1854,7 +1854,7 @@
           <w:color w:val="4A4A6A"/>
           <w:sz w:val="22"/>
         </w:rPr>
-        <w:t>AR gözlükler (Meta Quest, Apple Vision Pro) ve akıllı saat entegrasyonuyla hands-free ilaç tanıma ve hatırlatma sistemi oluşturulabilir. Bu, yaşlı hastalar için kullanım kolaylığını katlamalı olarak artırır.</w:t>
+        <w:t>Aynı mimari; böbrek nakli, kalp nakli, diyabet, onkoloji gibi alanlara adapte edilebilir. Her hastalık için özelleştirilmiş OCR anahtar kelime listesi ve ilaç protokolü eklenebilir. Firebase, çok tenant mimarisine uygundur.</w:t>
       </w:r>
     </w:p>
     <w:p>
@@ -1877,7 +1877,7 @@
           <w:color w:val="1A1A2E"/>
           <w:sz w:val="22"/>
         </w:rPr>
-        <w:t>Eczane ve İlaç Firması Ortaklıkları:</w:t>
+        <w:t>Bakıcı Modunun Klinisyen Portala Dönüştürülmesi:</w:t>
       </w:r>
       <w:r>
         <w:rPr>
@@ -1885,7 +1885,7 @@
           <w:color w:val="4A4A6A"/>
           <w:sz w:val="22"/>
         </w:rPr>
-        <w:t>İlaç firmaları (Novartis, Pfizer) ve eczane zincirleriyle sponsorluk anlaşmaları yapılarak, uygulama ücretsiz dağıtılabilir ve ilaç bilgi içeriği zenginleştirilebilir.</w:t>
+        <w:t>Bakıcı ID sorgulama altyapısı, doktor ve hemşire için web paneli (React veya Next.js) ile genişletilebilir. Doktor birden fazla hastanın uyum raporunu tek ekrandan görebilir.</w:t>
       </w:r>
     </w:p>
     <w:p>
@@ -1908,7 +1908,7 @@
           <w:color w:val="1A1A2E"/>
           <w:sz w:val="22"/>
         </w:rPr>
-        <w:t>Akademik Araştırma Potansiyeli:</w:t>
+        <w:t>Akademik Araştırma ve Klinik Çalışmalar:</w:t>
       </w:r>
       <w:r>
         <w:rPr>
@@ -1916,7 +1916,7 @@
           <w:color w:val="4A4A6A"/>
           <w:sz w:val="22"/>
         </w:rPr>
-        <w:t>Proje, 'AR tabanlı ilaç uyumluluğu' alanında akademik yayın ve tez çalışmaları için özgün bir vaka sunmaktadır. Üniversite hastaneleriyle klinik çalışmalar planlanabilir.</w:t>
+        <w:t>Firestore'da biriken gerçek zamanlı ilaç uyum verileri; 'AR + bulut tabanlı hatırlatma sistemlerinin organ nakli sonrası uyuma etkisi' konusunda özgün akademik yayın ve tez materyali sunmaktadır.</w:t>
       </w:r>
     </w:p>
     <w:p>
@@ -1947,7 +1947,7 @@
           <w:color w:val="4A4A6A"/>
           <w:sz w:val="22"/>
         </w:rPr>
-        <w:t>Türkiye'nin dijital sağlık dönüşümü stratejisi ve e-Nabız entegrasyonlarıyla uyumlu bir şekilde konumlanarak, SGK veya Sağlık Bakanlığı desteği alınabilir.</w:t>
+        <w:t>Türkiye'nin dijital sağlık dönüşümü stratejisi ve e-Nabız entegrasyonlarıyla uyumlu konumlanarak SGK veya Sağlık Bakanlığı desteği alınabilir. Bakıcı takip modu, yaşlı bakımı politikalarına doğrudan katkı sağlar.</w:t>
       </w:r>
     </w:p>
     <w:p>
@@ -1970,7 +1970,7 @@
           <w:color w:val="1A1A2E"/>
           <w:sz w:val="22"/>
         </w:rPr>
-        <w:t>Çok Dilli Genişleme:</w:t>
+        <w:t>IoT ve Akıllı İlaç Kutusu Entegrasyonu:</w:t>
       </w:r>
       <w:r>
         <w:rPr>
@@ -1978,7 +1978,7 @@
           <w:color w:val="4A4A6A"/>
           <w:sz w:val="22"/>
         </w:rPr>
-        <w:t>Uygulama altyapısı dil desteğine uygun tasarlanmıştır. Arapça, Kürtçe, Almanca gibi dillerin eklenmesiyle diaspora toplulukları ve uluslararası pazarlara açılabilir.</w:t>
+        <w:t>Bluetooth destekli akıllı ilaç kutuları ile entegrasyon sağlanarak fiziksel ilaç alımının otomatik Firebase'e yazılması ve bakıcıya anlık bildirim gönderilmesi mümkün hale getirilebilir.</w:t>
       </w:r>
     </w:p>
     <w:p>
@@ -2001,7 +2001,7 @@
           <w:color w:val="1A1A2E"/>
           <w:sz w:val="22"/>
         </w:rPr>
-        <w:t>IoT ve Akıllı İlaç Kutusu Entegrasyonu:</w:t>
+        <w:t>Giyilebilir Cihaz &amp; Bildirim Genişlemesi:</w:t>
       </w:r>
       <w:r>
         <w:rPr>
@@ -2009,7 +2009,7 @@
           <w:color w:val="4A4A6A"/>
           <w:sz w:val="22"/>
         </w:rPr>
-        <w:t>Bluetooth destekli akıllı ilaç kutuları ile entegrasyon sağlanarak, fiziksel ilaç alımının otomatik takibi ve doktora raporlanması mümkün hale getirilebilir.</w:t>
+        <w:t>@notifee altyapısı Wear OS uyumlu akıllı saatlere genişletilebilir. Hasta bileğinde titreşimli ilaç hatırlatması, özellikle yaşlı kullanıcılar için telefon bildiriminden daha güvenilir bir alternatif sunar.</w:t>
       </w:r>
     </w:p>
     <w:p>
@@ -2032,7 +2032,7 @@
           <w:color w:val="1A1A2E"/>
           <w:sz w:val="22"/>
         </w:rPr>
-        <w:t>Teletıp Entegrasyonu:</w:t>
+        <w:t>Eczane ve İlaç Firması Ortaklıkları:</w:t>
       </w:r>
       <w:r>
         <w:rPr>
@@ -2040,7 +2040,7 @@
           <w:color w:val="4A4A6A"/>
           <w:sz w:val="22"/>
         </w:rPr>
-        <w:t>Video görüşme modülü eklenerek, hasta AR kamerasıyla ilacı gösterirken doktorun uzaktan doğrulama yapması ve anlık reçete düzenlemesi sağlanabilir.</w:t>
+        <w:t>Novartis ve Pfizer gibi üreticilerle sponsorluk anlaşmaları yapılarak ilaç veritabanı genişletilebilir, 3D model kütüphanesi zenginleştirilebilir. Bakıcı izleme verileri anonim olarak ilaç firmaları için değerli uyum araştırması sağlar.</w:t>
       </w:r>
     </w:p>
     <w:p>
@@ -2080,7 +2080,7 @@
           <w:color w:val="1A1A2E"/>
           <w:sz w:val="22"/>
         </w:rPr>
-        <w:t>Yasal ve Düzenleyici Riskler:</w:t>
+        <w:t>Açık Firestore Kurallarından Kaynaklanan Güvenlik Riski:</w:t>
       </w:r>
       <w:r>
         <w:rPr>
@@ -2088,7 +2088,7 @@
           <w:color w:val="4A4A6A"/>
           <w:sz w:val="22"/>
         </w:rPr>
-        <w:t>Tıbbi cihaz yazılımı olarak sınıflandırılma riski mevcuttur. T.C. İlaç ve Tıbbi Cihaz Kurumu (TİTCK) veya CE/FDA onayı gerekebilir. Onay süreçleri uzun ve maliyetli olabilir.</w:t>
+        <w:t>Geliştirme aşamasında kullanılan 'allow read, write: if true' kuralları, gerçek hasta verilerinin kötü niyetli kişilerce okunmasına veya değiştirilmesine olanak tanır. Klinik kullanım öncesi bu kuralların kesinlikle sıkılaştırılması gerekir.</w:t>
       </w:r>
     </w:p>
     <w:p>
@@ -2111,7 +2111,7 @@
           <w:color w:val="1A1A2E"/>
           <w:sz w:val="22"/>
         </w:rPr>
-        <w:t>Veri Gizliliği ve KVKK Uyumu:</w:t>
+        <w:t>Yasal ve Düzenleyici Riskler:</w:t>
       </w:r>
       <w:r>
         <w:rPr>
@@ -2119,7 +2119,7 @@
           <w:color w:val="4A4A6A"/>
           <w:sz w:val="22"/>
         </w:rPr>
-        <w:t>Kamera kullanımı ve sağlık verisi işlenmesi, KVKK (Kişisel Verilerin Korunması Kanunu) ve GDPR kapsamında ciddi yükümlülükler doğurur. Veri ihlali durumunda ağır yaptırımlar uygulanabilir.</w:t>
+        <w:t>Tıbbi cihaz yazılımı olarak sınıflandırılma riski mevcuttur. T.C. İlaç ve Tıbbi Cihaz Kurumu (TİTCK) onayı gerekebilir. Firestore'da sağlık verisi saklanması, KVKK ve GDPR kapsamında ek yükümlülükler doğurur.</w:t>
       </w:r>
     </w:p>
     <w:p>
@@ -2142,7 +2142,7 @@
           <w:color w:val="1A1A2E"/>
           <w:sz w:val="22"/>
         </w:rPr>
-        <w:t>Teknolojik Eskime Riski:</w:t>
+        <w:t>Hasta Güvenliği Riskleri:</w:t>
       </w:r>
       <w:r>
         <w:rPr>
@@ -2150,7 +2150,7 @@
           <w:color w:val="4A4A6A"/>
           <w:sz w:val="22"/>
         </w:rPr>
-        <w:t>React Native, ViroReact ve ARCore kütüphanelerinin sürdürülebilirliği üçüncü taraf topluluklara bağlıdır. ViroReact'ın topluluk tarafından sürdürülmesi, uzun vadede bakım ve güncelleme riskleri oluşturur.</w:t>
+        <w:t>Hatalı OCR tanıma veya yanlış saat bilgisi, hastanın yanlış ilacı almasına ya da dozu kaçırmasına neden olabilir. Karaciğer nakli hastalarında bu durum organ reddi gibi hayati sonuçlara yol açabilir. 'İlacı Aldım' onayı bu riski azaltsa da ortadan kaldırmaz.</w:t>
       </w:r>
     </w:p>
     <w:p>
@@ -2173,7 +2173,7 @@
           <w:color w:val="1A1A2E"/>
           <w:sz w:val="22"/>
         </w:rPr>
-        <w:t>Hasta Güvenliği Riskleri:</w:t>
+        <w:t>Firebase Bağımlılığı ve Tek Tedarikçi Riski:</w:t>
       </w:r>
       <w:r>
         <w:rPr>
@@ -2181,7 +2181,7 @@
           <w:color w:val="4A4A6A"/>
           <w:sz w:val="22"/>
         </w:rPr>
-        <w:t>Yanlış ilaç tanıma veya hatalı saat bilgisi, hastanın yanlış ilacı almasına veya dozunu kaçırmasına neden olabilir. Karaciğer nakli hastalarında bu durum organ reddi gibi hayati sonuçlara yol açabilir.</w:t>
+        <w:t>Google Firebase'in fiyatlandırma politikası değiştiğinde veya servis kesintisi yaşandığında bakıcı modu ve bulut senkronizasyonu devre dışı kalır. Uygulama offline çalışmaya devam etse de veri paylaşımı etkilenir.</w:t>
       </w:r>
     </w:p>
     <w:p>
@@ -2212,7 +2212,7 @@
           <w:color w:val="4A4A6A"/>
           <w:sz w:val="22"/>
         </w:rPr>
-        <w:t>Medisafe, MyTherapy, Pill Reminder gibi olgun ilaç hatırlatma uygulamaları milyonlarca kullanıcıya sahiptir. AR özelliği diferansiyasyon sağlasa da, bu uygulamaların geniş özellik seti ve kullanıcı tabanı ciddi rekabet oluşturur.</w:t>
+        <w:t>Medisafe, MyTherapy ve Pill Reminder gibi olgun uygulamalar milyonlarca kullanıcıya sahiptir. Bu uygulamalar bakıcı bildirimi, çok ilaçlı takip ve doktor entegrasyonu gibi özelliklere zaten sahipken, Nefes Saati'nin AR ve OCR farkı tek başına yeterli diferansiyasyon sağlamayabilir.</w:t>
       </w:r>
     </w:p>
     <w:p>
@@ -2243,7 +2243,7 @@
           <w:color w:val="4A4A6A"/>
           <w:sz w:val="22"/>
         </w:rPr>
-        <w:t>Hedef kitle olan 60+ yaş grubu, AR teknolojisine adapte olmakta güçlük çekebilir. Akıllı telefon kullanım oranlarının bu yaş grubunda düşük olması, uygulama benimsenmesini olumsuz etkileyebilir.</w:t>
+        <w:t>Hedef kitle olan 60+ yaş grubu, AR kamera kullanımı, ID paylaşımı ve bildirim yönetimine adapte olmakta güçlük çekebilir. Uygulamanın görece zenginleşen özellik seti, başlangıçtaki minimal tasarım ilkesiyle çelişme riski taşır.</w:t>
       </w:r>
     </w:p>
     <w:p>
@@ -2266,7 +2266,7 @@
           <w:color w:val="1A1A2E"/>
           <w:sz w:val="22"/>
         </w:rPr>
-        <w:t>ARCore Platformu Kısıtlamaları:</w:t>
+        <w:t>Yanlış Tıbbi Bilgi Riski:</w:t>
       </w:r>
       <w:r>
         <w:rPr>
@@ -2274,7 +2274,7 @@
           <w:color w:val="4A4A6A"/>
           <w:sz w:val="22"/>
         </w:rPr>
-        <w:t>Google'ın ARCore desteğini azaltması veya API değişiklikleri yapması durumunda, uygulamanın AR fonksiyonları çalışmaz hale gelebilir. Platform bağımlılığı stratejik bir risk oluşturur.</w:t>
+        <w:t>İlaç bilgilerinin güncel ve doğru tutulması sorumluluğu kritiktir. Güncel olmayan prospektüs bilgileri veya doz saatleri hukuki sorumluluk doğurabilir. Firebase'de saklanan verinin doğruluğu uygulama tarafından doğrulanamamaktadır.</w:t>
       </w:r>
     </w:p>
     <w:p>
@@ -2297,7 +2297,7 @@
           <w:color w:val="1A1A2E"/>
           <w:sz w:val="22"/>
         </w:rPr>
-        <w:t>Yanlış Tıbbi Bilgi Riski:</w:t>
+        <w:t>Siber Güvenlik Tehditleri:</w:t>
       </w:r>
       <w:r>
         <w:rPr>
@@ -2305,7 +2305,7 @@
           <w:color w:val="4A4A6A"/>
           <w:sz w:val="22"/>
         </w:rPr>
-        <w:t>Uygulamanın sağladığı ilaç bilgilerinin güncel ve doğru tutulması sorumluluğu kritiktir. Güncel olmayan prospektüs bilgileri veya doz önerileri hukuki sorumluluk doğurabilir.</w:t>
+        <w:t>Sağlık verilerini hedefleyen siber saldırılar artmaktadır. AsyncStorage ve Firestore'daki verilerin şifrelenmemiş olması, cihaz çalınması veya kötü amaçlı yazılım bulaşması durumunda hasta bilgilerini riske atar.</w:t>
       </w:r>
     </w:p>
     <w:p>
@@ -2328,7 +2328,7 @@
           <w:color w:val="1A1A2E"/>
           <w:sz w:val="22"/>
         </w:rPr>
-        <w:t>Cihaz Donanım Gereksinimleri:</w:t>
+        <w:t>Platform ve Kütüphane Eskime Riski:</w:t>
       </w:r>
       <w:r>
         <w:rPr>
@@ -2336,7 +2336,7 @@
           <w:color w:val="4A4A6A"/>
           <w:sz w:val="22"/>
         </w:rPr>
-        <w:t>AR uygulamaları yüksek işlemci gücü ve pil tüketimi gerektirir. Yaşlı hastaların cihazlarının bu gereksinimleri karşılamaması veya pilin hızla tükenmesi, kullanıcı memnuniyetini düşürebilir.</w:t>
+        <w:t>React Native 0.83, @notifee, @react-native-firebase gibi bağımlılıkların büyük versiyon güncellemeleri kırıcı değişiklikler getirebilir. Özellikle yeni React Native mimarisi (Fabric/TurboModules) bazı kütüphanelerin yeniden yazılmasını gerektirebilir.</w:t>
       </w:r>
     </w:p>
     <w:p>
@@ -2359,7 +2359,7 @@
           <w:color w:val="1A1A2E"/>
           <w:sz w:val="22"/>
         </w:rPr>
-        <w:t>Siber Güvenlik Tehditleri:</w:t>
+        <w:t>Cihaz Donanım Gereksinimleri:</w:t>
       </w:r>
       <w:r>
         <w:rPr>
@@ -2367,7 +2367,7 @@
           <w:color w:val="4A4A6A"/>
           <w:sz w:val="22"/>
         </w:rPr>
-        <w:t>Sağlık verilerini hedefleyen siber saldırılar artmaktadır. Yerel depolama şifrelenmemiş olması durumunda, cihaz çalınması veya kötü amaçlı yazılım bulaşması halinde hasta verileri risk altına girebilir.</w:t>
+        <w:t>Kamera sürekli kullanımı, Firestore ağ bağlantısı ve @notifee alarm işlemleri pil tüketimini artırır. Yaşlı hastaların genellikle eski ve düşük kapasiteli cihaz kullanması, uzun süreli kullanım deneyimini olumsuz etkileyebilir.</w:t>
       </w:r>
     </w:p>
     <w:p>
@@ -2530,7 +2530,7 @@
                 <w:color w:val="1A1A2E"/>
                 <w:sz w:val="21"/>
               </w:rPr>
-              <w:t>Artırılmış Gerçeklik (AR) Teknolojisi</w:t>
+              <w:t>OCR Tabanlı İlaç Tanıma (ML Kit)</w:t>
             </w:r>
           </w:p>
           <w:p>
@@ -2574,7 +2574,7 @@
                 <w:color w:val="1A1A2E"/>
                 <w:sz w:val="21"/>
               </w:rPr>
-              <w:t>Yaşlı Dostu Arayüz Tasarımı</w:t>
+              <w:t>Haftalık Rutinim &amp; İlaç Geçmiş Takibi</w:t>
             </w:r>
           </w:p>
           <w:p>
@@ -2596,7 +2596,7 @@
                 <w:color w:val="1A1A2E"/>
                 <w:sz w:val="21"/>
               </w:rPr>
-              <w:t>Gerçek Zamanlı Geri Sayım Sistemi</w:t>
+              <w:t>Onaylı Doz Kaydı — 'İlacı Aldım' Sistemi</w:t>
             </w:r>
           </w:p>
           <w:p>
@@ -2618,7 +2618,7 @@
                 <w:color w:val="1A1A2E"/>
                 <w:sz w:val="21"/>
               </w:rPr>
-              <w:t>Kişiselleştirilebilir İlaç Saatleri</w:t>
+              <w:t>Akıllı Bildirim &amp; Alarm Sistemi</w:t>
             </w:r>
           </w:p>
           <w:p>
@@ -2640,7 +2640,7 @@
                 <w:color w:val="1A1A2E"/>
                 <w:sz w:val="21"/>
               </w:rPr>
-              <w:t>Offline Çalışma Kapasitesi</w:t>
+              <w:t>Firebase Firestore Bulut Senkronizasyonu</w:t>
             </w:r>
           </w:p>
         </w:tc>
@@ -2691,7 +2691,7 @@
                 <w:color w:val="1A1A2E"/>
                 <w:sz w:val="21"/>
               </w:rPr>
-              <w:t>AR Görüntü Tanıma Hassasiyeti</w:t>
+              <w:t>OCR Tanıma Güvenilirliği</w:t>
             </w:r>
           </w:p>
           <w:p>
@@ -2713,7 +2713,7 @@
                 <w:color w:val="1A1A2E"/>
                 <w:sz w:val="21"/>
               </w:rPr>
-              <w:t>İnternet Bağımsız Güncelleme Eksikliği</w:t>
+              <w:t>Açık Firestore Güvenlik Kuralları</w:t>
             </w:r>
           </w:p>
           <w:p>
@@ -2757,7 +2757,7 @@
                 <w:color w:val="1A1A2E"/>
                 <w:sz w:val="21"/>
               </w:rPr>
-              <w:t>Bildirim/Alarm Eksikliği</w:t>
+              <w:t>Doktor-Hasta Entegrasyonu Yok</w:t>
             </w:r>
           </w:p>
           <w:p>
@@ -2779,7 +2779,7 @@
                 <w:color w:val="1A1A2E"/>
                 <w:sz w:val="21"/>
               </w:rPr>
-              <w:t>Doktor-Hasta Entegrasyonu Yok</w:t>
+              <w:t>İlaç Etkileşimi Bilgisi Yok</w:t>
             </w:r>
           </w:p>
         </w:tc>
@@ -2833,7 +2833,7 @@
                 <w:color w:val="1A1A2E"/>
                 <w:sz w:val="21"/>
               </w:rPr>
-              <w:t>Sağlık Sektöründe AR Büyümesi</w:t>
+              <w:t>Sağlık Sektöründe Dijital Dönüşüm</w:t>
             </w:r>
           </w:p>
           <w:p>
@@ -2855,7 +2855,7 @@
                 <w:color w:val="1A1A2E"/>
                 <w:sz w:val="21"/>
               </w:rPr>
-              <w:t>Hastane ve Klinik Entegrasyonları</w:t>
+              <w:t>Hastane Taburculuk Süreci Entegrasyonu</w:t>
             </w:r>
           </w:p>
           <w:p>
@@ -2877,7 +2877,29 @@
                 <w:color w:val="1A1A2E"/>
                 <w:sz w:val="21"/>
               </w:rPr>
-              <w:t>Yapay Zeka ile İlaç Tanıma Geliştirme</w:t>
+              <w:t>Firebase Altyapısının Genişletilmesi</w:t>
+            </w:r>
+          </w:p>
+          <w:p>
+            <w:pPr>
+              <w:ind w:left="283"/>
+            </w:pPr>
+            <w:r>
+              <w:rPr>
+                <w:rFonts w:ascii="Calibri" w:hAnsi="Calibri"/>
+                <w:b/>
+                <w:color w:val="2980B9"/>
+                <w:sz w:val="20"/>
+              </w:rPr>
+              <w:t xml:space="preserve">● </w:t>
+            </w:r>
+            <w:r>
+              <w:rPr>
+                <w:rFonts w:ascii="Calibri" w:hAnsi="Calibri"/>
+                <w:color w:val="1A1A2E"/>
+                <w:sz w:val="21"/>
+              </w:rPr>
+              <w:t>Yapay Zeka Destekli Tanıma</w:t>
             </w:r>
           </w:p>
           <w:p>
@@ -2921,29 +2943,7 @@
                 <w:color w:val="1A1A2E"/>
                 <w:sz w:val="21"/>
               </w:rPr>
-              <w:t>Giyilebilir Cihaz Entegrasyonu</w:t>
-            </w:r>
-          </w:p>
-          <w:p>
-            <w:pPr>
-              <w:ind w:left="283"/>
-            </w:pPr>
-            <w:r>
-              <w:rPr>
-                <w:rFonts w:ascii="Calibri" w:hAnsi="Calibri"/>
-                <w:b/>
-                <w:color w:val="2980B9"/>
-                <w:sz w:val="20"/>
-              </w:rPr>
-              <w:t xml:space="preserve">● </w:t>
-            </w:r>
-            <w:r>
-              <w:rPr>
-                <w:rFonts w:ascii="Calibri" w:hAnsi="Calibri"/>
-                <w:color w:val="1A1A2E"/>
-                <w:sz w:val="21"/>
-              </w:rPr>
-              <w:t>Eczane ve İlaç Firması Ortaklıkları</w:t>
+              <w:t>Bakıcı Modunun Klinisyen Portala Dönüştürülmesi</w:t>
             </w:r>
           </w:p>
         </w:tc>
@@ -2957,6 +2957,28 @@
               <w:ind w:left="283"/>
             </w:pPr>
             <w:r/>
+            <w:r>
+              <w:rPr>
+                <w:rFonts w:ascii="Calibri" w:hAnsi="Calibri"/>
+                <w:b/>
+                <w:color w:val="E67E22"/>
+                <w:sz w:val="20"/>
+              </w:rPr>
+              <w:t xml:space="preserve">● </w:t>
+            </w:r>
+            <w:r>
+              <w:rPr>
+                <w:rFonts w:ascii="Calibri" w:hAnsi="Calibri"/>
+                <w:color w:val="1A1A2E"/>
+                <w:sz w:val="21"/>
+              </w:rPr>
+              <w:t>Açık Firestore Kurallarından Kaynaklanan Güvenlik Riski</w:t>
+            </w:r>
+          </w:p>
+          <w:p>
+            <w:pPr>
+              <w:ind w:left="283"/>
+            </w:pPr>
             <w:r>
               <w:rPr>
                 <w:rFonts w:ascii="Calibri" w:hAnsi="Calibri"/>
@@ -2994,7 +3016,7 @@
                 <w:color w:val="1A1A2E"/>
                 <w:sz w:val="21"/>
               </w:rPr>
-              <w:t>Veri Gizliliği ve KVKK Uyumu</w:t>
+              <w:t>Hasta Güvenliği Riskleri</w:t>
             </w:r>
           </w:p>
           <w:p>
@@ -3016,29 +3038,7 @@
                 <w:color w:val="1A1A2E"/>
                 <w:sz w:val="21"/>
               </w:rPr>
-              <w:t>Teknolojik Eskime Riski</w:t>
-            </w:r>
-          </w:p>
-          <w:p>
-            <w:pPr>
-              <w:ind w:left="283"/>
-            </w:pPr>
-            <w:r>
-              <w:rPr>
-                <w:rFonts w:ascii="Calibri" w:hAnsi="Calibri"/>
-                <w:b/>
-                <w:color w:val="E67E22"/>
-                <w:sz w:val="20"/>
-              </w:rPr>
-              <w:t xml:space="preserve">● </w:t>
-            </w:r>
-            <w:r>
-              <w:rPr>
-                <w:rFonts w:ascii="Calibri" w:hAnsi="Calibri"/>
-                <w:color w:val="1A1A2E"/>
-                <w:sz w:val="21"/>
-              </w:rPr>
-              <w:t>Hasta Güvenliği Riskleri</w:t>
+              <w:t>Firebase Bağımlılığı ve Tek Tedarikçi Riski</w:t>
             </w:r>
           </w:p>
           <w:p>
@@ -3841,7 +3841,7 @@
           <w:color w:val="4A4A6A"/>
           <w:sz w:val="22"/>
         </w:rPr>
-        <w:t>AR teknolojisinin sezgisel yapısını kullanarak hastane taburculuk süreçlerine entegre olun. Yaşlı dostu arayüz, hastane yöneticileri için güçlü bir satış argümanıdır.</w:t>
+        <w:t>Bakıcı modu + Firebase altyapısını kullanarak hastane taburculuk paketine entegre olun. Hasta uyum verilerinin Firestore'dan klinik panele aktarılması, hastane yöneticileri için güçlü bir satış argümanıdır.</w:t>
       </w:r>
     </w:p>
     <w:p>
@@ -3864,7 +3864,7 @@
           <w:color w:val="4A4A6A"/>
           <w:sz w:val="22"/>
         </w:rPr>
-        <w:t>3D model ve TTS altyapısını genişleterek, yapay zeka destekli ilaç tanıma sistemine geçiş yapın. Bu, ARCore marker bağımlılığını ortadan kaldırır ve tanıma doğruluğunu artırır.</w:t>
+        <w:t>OCR + 3D model + TTS altyapısını ML tabanlı görüntü sınıflandırmasıyla güçlendirin. On-device TensorFlow Lite modeli, kutu durumundan bağımsız çok daha güvenilir tanıma sağlar.</w:t>
       </w:r>
     </w:p>
     <w:p>
@@ -3887,7 +3887,7 @@
           <w:color w:val="4A4A6A"/>
           <w:sz w:val="22"/>
         </w:rPr>
-        <w:t>React Native'in çapraz platform avantajını kullanarak iOS sürümünü çıkarın. Böylece hasta erişim tabanını iki katına çıkarabilirsiniz.</w:t>
+        <w:t>React Native'in çapraz platform avantajını kullanarak iOS sürümünü çıkarın. Bakıcı modunun iOS'ta da çalışması, aile üyelerinin farklı platformlardan takip yapmasını sağlar.</w:t>
       </w:r>
     </w:p>
     <w:p>
@@ -3910,7 +3910,7 @@
           <w:color w:val="4A4A6A"/>
           <w:sz w:val="22"/>
         </w:rPr>
-        <w:t>Offline çalışma kapasitesini öne çıkararak kırsal bölgelerdeki hastanelere ve sağlık ocaklarına ulaşın.</w:t>
+        <w:t>Akademik yayınlar için Firestore'daki anonim uyum verilerini kullanın. 'Bulut senkronizasyonlu AR hatırlatma sistemlerinin organ nakli sonrası uyuma etkisi' tezi için gerçek veri mevcuttur.</w:t>
       </w:r>
     </w:p>
     <w:p>
@@ -3933,7 +3933,7 @@
           <w:color w:val="4A4A6A"/>
           <w:sz w:val="22"/>
         </w:rPr>
-        <w:t>Akademik yayınlar ve klinik çalışmalarla projenin bilimsel geçerliliğini kanıtlayın; bu, devlet desteği ve hibe almayı kolaylaştırır.</w:t>
+        <w:t>Offline-first mimarisini öne çıkararak kırsal bölgelerdeki hastanelere ulaşın; bağlantı gelince senkronize olan yapı, düşük internet kalitesinde bile güvenilirlik sağlar.</w:t>
       </w:r>
     </w:p>
     <w:p>
@@ -3968,7 +3968,7 @@
           <w:color w:val="4A4A6A"/>
           <w:sz w:val="22"/>
         </w:rPr>
-        <w:t>İlaç veritabanı sınırlılığını, eczane ve ilaç firması ortaklıklarıyla aşın. Novartis ve Pfizer gibi firmalardan ilaç verisi ve finansal destek alın.</w:t>
+        <w:t>Firestore güvenlik kurallarını Firebase Authentication veya cihaz ID doğrulamasıyla sıkılaştırın. Bu adım, gerçek hasta verisiyle çalışmak için ön koşuldur.</w:t>
       </w:r>
     </w:p>
     <w:p>
@@ -3991,7 +3991,7 @@
           <w:color w:val="4A4A6A"/>
           <w:sz w:val="22"/>
         </w:rPr>
-        <w:t>Bildirim eksikliğini gidermek için push notification ve alarm sistemi ekleyin. Bu özellik, rekabet avantajını önemli ölçüde artıracaktır.</w:t>
+        <w:t>İlaç veritabanı sınırlılığını eczane ve ilaç firması ortaklıklarıyla aşın; Tacrolimus, CellCept gibi nakil ilaçlarını OCR listesine ve Firestore'a ekleyin.</w:t>
       </w:r>
     </w:p>
     <w:p>
@@ -4014,7 +4014,7 @@
           <w:color w:val="4A4A6A"/>
           <w:sz w:val="22"/>
         </w:rPr>
-        <w:t>Doktor-hasta entegrasyonu eksikliğini teletıp modülüyle çözün. Bulut tabanlı bir backend ile doktorların hasta ilaç programını uzaktan yönetmesini sağlayın.</w:t>
+        <w:t>Bakıcı modunu çift yönlü hale getirin: bakıcı yalnızca izlemekle kalmayıp hastaya 'ilacını al' bildirimi gönderebilsin, saat programını uzaktan düzenleyebilsin.</w:t>
       </w:r>
     </w:p>
     <w:p>
@@ -4037,7 +4037,7 @@
           <w:color w:val="4A4A6A"/>
           <w:sz w:val="22"/>
         </w:rPr>
-        <w:t>ARCore cihaz bağımlılığını azaltmak için, AR desteklemeyen cihazlarda kamera tabanlı basit ilaç tanıma modu (fallback) sunun.</w:t>
+        <w:t>Doktor-hasta entegrasyonu için Firestore üzerine bir web paneli (React/Next.js) inşa edin. Mevcut veri modeli bu genişlemeye hazırdır, ek backend mimarisi gerekmez.</w:t>
       </w:r>
     </w:p>
     <w:p>
@@ -4060,7 +4060,7 @@
           <w:color w:val="4A4A6A"/>
           <w:sz w:val="22"/>
         </w:rPr>
-        <w:t>Erişilebilirlik sınırlamalarını TalkBack uyumluluğu ve sesli navigasyon ile aşarak, engelli hasta grubuna da hizmet verin.</w:t>
+        <w:t>Erişilebilirlik sınırlamalarını TalkBack uyumluluğu ve sesli navigasyon ile aşarak engelli hasta grubuna hizmet verin; yaşlı dostu tasarım ilkesi bu entegrasyonu kolaylaştırmaktadır.</w:t>
       </w:r>
     </w:p>
     <w:p>
@@ -4095,7 +4095,7 @@
           <w:color w:val="4A4A6A"/>
           <w:sz w:val="22"/>
         </w:rPr>
-        <w:t>Yasal riskleri minimize etmek için 'tıbbi bilgi aracı' olarak konumlanın, 'tıbbi cihaz' sınıflandırmasından kaçının. Uygulama içi yasal uyarılar ekleyin.</w:t>
+        <w:t>Firestore güvenlik riskine karşı, 'İlacı Aldım' onay sisteminin oluşturduğu audit trail'i veri bütünlüğü kanıtı olarak belgelendirin. KVKK uyumu için kamera verilerinin cihaz üzerinde işlendiğini ve sunucuya gönderilmediğini açıkça ilan edin.</w:t>
       </w:r>
     </w:p>
     <w:p>
@@ -4118,7 +4118,7 @@
           <w:color w:val="4A4A6A"/>
           <w:sz w:val="22"/>
         </w:rPr>
-        <w:t>Hasta güvenliği risklerini azaltmak için çoklu doğrulama sistemi uygulayın: ilaç tanındığında hastaya 'Bu ilacı aldığınızı onaylıyor musunuz?' sorusu sorun.</w:t>
+        <w:t>Hasta güvenliği için OCR tanıma sonucuna 'Bu ilacı mı kullanıyorsunuz? Eğer yanlışsa taramayı iptal edin.' onay adımı ekleyin. 'İlacı Aldım' butonu bu zinciri tamamlar.</w:t>
       </w:r>
     </w:p>
     <w:p>
@@ -4141,7 +4141,7 @@
           <w:color w:val="4A4A6A"/>
           <w:sz w:val="22"/>
         </w:rPr>
-        <w:t>ViroReact teknolojik eskime riskine karşı, AR katmanını soyutlanmış bir mimariyle tasarlayın. Böylece gelecekte başka bir AR SDK'ya geçiş kolay olur.</w:t>
+        <w:t>Rekabet tehdidine karşı, Auth-free cihaz ID + bakıcı takip + AR tanıma kombinasyonunu farklılaştırıcı özellik olarak öne çıkarın; patent veya faydalı model başvurusu yapın.</w:t>
       </w:r>
     </w:p>
     <w:p>
@@ -4164,7 +4164,7 @@
           <w:color w:val="4A4A6A"/>
           <w:sz w:val="22"/>
         </w:rPr>
-        <w:t>Rekabet tehdidine karşı, AR ile ilaç tanıma özelliğini patent veya faydalı model ile koruma altına alın.</w:t>
+        <w:t>Firebase tek tedarikçi riskine karşı, servis katmanını soyutlayın (firestoreService.ts zaten bunu yapmaktadır). Gerektiğinde Supabase veya MongoDB Atlas'a geçiş minimum eforla mümkün olsun.</w:t>
       </w:r>
     </w:p>
     <w:p>
@@ -4187,7 +4187,7 @@
           <w:color w:val="4A4A6A"/>
           <w:sz w:val="22"/>
         </w:rPr>
-        <w:t>KVKK uyumu için kamera verilerinin cihaz üzerinde işlenip sunucuya gönderilmediğini belgeleyin ve gizlilik politikası oluşturun.</w:t>
+        <w:t>Yasal riskleri minimize etmek için 'tıbbi bilgi aracı' konumlamasını koruyun, 'tıbbi cihaz' sınıflandırmasından kaçının; uygulama içi sorumluluk reddi beyanları ekleyin.</w:t>
       </w:r>
     </w:p>
     <w:p>
@@ -4222,7 +4222,7 @@
           <w:color w:val="4A4A6A"/>
           <w:sz w:val="22"/>
         </w:rPr>
-        <w:t>Sınırlı ilaç veritabanı ve yasal riskler birleştiğinde, yanlış tanıma riski artar. Bu nedenle, tanınmayan ilaçlar için 'Bu ilacı tanıyamadım, lütfen doktorunuza danışın' mesajı zorunlu olmalıdır.</w:t>
+        <w:t>Açık Firestore kuralları + siber güvenlik tehdidi: Üretim öncesinde mutlaka kural sıkılaştırması yapın. Geçiş dönemi için en azından cihaz ID eşleşmesi zorunluluğu getiren kural seti hazırlayın.</w:t>
       </w:r>
     </w:p>
     <w:p>
@@ -4245,7 +4245,7 @@
           <w:color w:val="4A4A6A"/>
           <w:sz w:val="22"/>
         </w:rPr>
-        <w:t>Yaşlı kullanıcı adaptasyon zorluğu ve donanım gereksinimleri birlikte ele alınmalıdır. Hasta yakınları için bir 'kurulum rehberi' ve cihaz uyumluluk listesi hazırlayın.</w:t>
+        <w:t>Sınırlı ilaç veritabanı + yanlış tanıma riski: Tanınmayan ilaçlar için 'Bu ilacı tanıyamadım, lütfen doktorunuza danışın' mesajı zorunlu tutun; kullanıcının manuel ilaç seçimi yapabileceği fallback mod ekleyin.</w:t>
       </w:r>
     </w:p>
     <w:p>
@@ -4268,7 +4268,7 @@
           <w:color w:val="4A4A6A"/>
           <w:sz w:val="22"/>
         </w:rPr>
-        <w:t>Veri yedekleme eksikliği ve siber güvenlik tehditleri birlikte çözülmelidir. Şifreli yerel depolama ve opsiyonel bulut yedekleme özelliği ekleyin.</w:t>
+        <w:t>Yaşlı adaptasyon zorluğu + özellik artışı çelişkisi: Yeni özellikleri (bakıcı modu, rutinim ekranı) 'ileri kullanıcı' segmentine yönlendirin; ana ekranı sade tutarak temel kullanım akışını koruyun.</w:t>
       </w:r>
     </w:p>
     <w:p>
@@ -4291,7 +4291,7 @@
           <w:color w:val="4A4A6A"/>
           <w:sz w:val="22"/>
         </w:rPr>
-        <w:t>Bildirim eksikliği ve ARCore kısıtlamaları, AR olmayan bir 'basit mod' ile dengelenebilir. Bu mod sadece ilaç listesi, geri sayım ve alarmları içerir.</w:t>
+        <w:t>Firebase bağımlılığı + platform eskime riski: Kritik iş mantığını (doz hesaplama, alarm planlama) servis katmanında izole tutun. Her kütüphane güncellemesinde entegrasyon testleri yapın.</w:t>
       </w:r>
     </w:p>
     <w:p>
@@ -4314,7 +4314,7 @@
           <w:color w:val="4A4A6A"/>
           <w:sz w:val="22"/>
         </w:rPr>
-        <w:t>Düzenleyici belirsizliğe karşı, Sağlık Bakanlığı ve TİTCK ile erken aşamada iletişime geçerek, uygulamanın yasal statüsünü netleştirin.</w:t>
+        <w:t>Düzenleyici belirsizliğe karşı Sağlık Bakanlığı ve TİTCK ile erken aşamada iletişime geçin; Firestore'da saklanan sağlık verisinin hukuki statüsünü netleştirmek klinik kullanım öncesinde zorunludur.</w:t>
       </w:r>
     </w:p>
     <w:p>
@@ -4345,7 +4345,7 @@
           <w:color w:val="1A1A2E"/>
           <w:sz w:val="22"/>
         </w:rPr>
-        <w:t>AR Sağlık Projesi, karaciğer nakli sonrası ilaç yönetimi alanında artırılmış gerçeklik teknolojisini kullanan yenilikçi bir çözüm olarak önemli bir potansiyel taşımaktadır. SWOT analizi sonuçları, projenin güçlü bir teknolojik temele sahip olduğunu, ancak bazı kritik alanlarda iyileştirme gerektirdiğini ortaya koymaktadır.</w:t>
+        <w:t>Nefes Saati, karaciğer nakli sonrası ilaç yönetimi alanında artırılmış gerçeklik, bulut senkronizasyonu ve bakıcı takip sistemi özelliklerini bir arada sunan kapsamlı bir dijital sağlık uygulamasıdır. SWOT analizi sonuçları, projenin güçlü bir teknolojik ve mimari temele sahip olduğunu; ancak güvenlik, veritabanı genişliği ve platform çeşitliliği konularında iyileştirme fırsatları barındırdığını ortaya koymaktadır.</w:t>
       </w:r>
     </w:p>
     <w:p>
@@ -4359,7 +4359,7 @@
           <w:color w:val="1A1A2E"/>
           <w:sz w:val="22"/>
         </w:rPr>
-        <w:t>Projenin en belirgin güçlü yönleri; AR tabanlı sezgisel ilaç tanıma, Türkçe sesli komut sistemi ve yaşlı dostu arayüz tasarımıdır. Bu özellikler, uygulamayı mevcut ilaç hatırlatma uygulamalarından açık bir şekilde farklılaştırmaktadır. Özellikle hastanın ilacını kameraya tutarak bilgi alması paradigması, dijital sağlık okuryazarlığı düşük olan yaşlı hastalar için devrim niteliğinde bir yaklaşımdır.</w:t>
+        <w:t>Projenin en belirgin güçlü yönleri; OCR tabanlı ilaç tanıma, Türkçe sesli bildirim, 'İlacı Aldım' onay sistemi, haftalık rutinim takibi ve ebeveyn/bakıcı uzaktan izleme modudur. Bu özellikler kombinasyonu, uygulamayı mevcut ilaç hatırlatma uygulamalarından net biçimde farklılaştırmaktadır. Özellikle local-first + Firebase senkronizasyonu mimarisi, hem çevrimdışı güvenilirliği hem de bulut tabanlı paylaşımı aynı anda garanti altına alır.</w:t>
       </w:r>
     </w:p>
     <w:p>
@@ -4373,7 +4373,7 @@
           <w:color w:val="1A1A2E"/>
           <w:sz w:val="22"/>
         </w:rPr>
-        <w:t>Öte yandan, sınırlı ilaç veritabanı, proaktif bildirim eksikliği ve tek platform desteği gibi zayıf yönler, uygulamanın klinik etkinliğini kısıtlamaktadır. Bu zayıflıkların giderilmesi, projenin piyasa başarısı için kritik öneme sahiptir.</w:t>
+        <w:t>Açık Firestore güvenlik kuralları, sınırlı ilaç veritabanı ve tek platform desteği gibi zayıf yönler, uygulamanın klinik ortama taşınabilmesi için öncelikli ele alınması gereken konulardır. Bu zayıflıkların giderilmesi, projenin gerçek hasta gruplarıyla kullanılabilmesi için zorunlu ön koşullardır.</w:t>
       </w:r>
     </w:p>
     <w:p>
@@ -4387,7 +4387,7 @@
           <w:color w:val="1A1A2E"/>
           <w:sz w:val="22"/>
         </w:rPr>
-        <w:t>Fırsatlar açısından değerlendirildiğinde, küresel AR sağlık pazarının hızlı büyümesi, hastane entegrasyonu potansiyeli ve yapay zeka ile güçlendirme imkanları, projenin gelecek vizyonunu oldukça parlak kılmaktadır. Ancak bu fırsatların değerlendirilmesi, yasal düzenlemeler, hasta güvenliği riskleri ve teknolojik eskime tehditleriyle dengelenmelidir.</w:t>
+        <w:t>Fırsatlar açısından bakıldığında, Firebase altyapısının doktor portalına, IoT entegrasyonuna ve akademik veri analizine dönüştürülme potansiyeli oldukça yüksektir. Mevcut Firestore veri modeli, bu genişlemeler için yeniden yapılandırma gerektirmeksizin temel oluşturmaktadır. Ancak bu fırsatların değerlendirilmesi; güvenlik kuralı sıkılaştırması, yasal düzenlemeler ve hasta güvenliği riskleriyle paralel yürütülmelidir.</w:t>
       </w:r>
     </w:p>
     <w:p>
@@ -4401,7 +4401,7 @@
           <w:color w:val="1A1A2E"/>
           <w:sz w:val="22"/>
         </w:rPr>
-        <w:t>Stratejik öneriler çerçevesinde, kısa vadede bildirim sistemi ve ilaç veritabanı genişletilmesi, orta vadede iOS desteği ve doktor entegrasyonu, uzun vadede ise yapay zeka destekli tanıma ve giyilebilir cihaz entegrasyonu hedeflenmelidir. Bu aşamalı yaklaşım, projenin sürdürülebilir büyümesini ve klinik etkisini maksimize edecektir.</w:t>
+        <w:t>Stratejik yol haritası olarak; kısa vadede Firestore güvenlik kurallarının sıkılaştırılması ve OCR veritabanının genişletilmesi, orta vadede iOS desteği ve çift yönlü bakıcı modu, uzun vadede doktor portalı ve ML tabanlı görüntü tanıma sistemi hedeflenmelidir. Bu aşamalı yaklaşım, projenin sürdürülebilir büyümesini ve klinik etkisini maksimize edecektir.</w:t>
       </w:r>
     </w:p>
     <w:p>
@@ -4415,7 +4415,7 @@
           <w:color w:val="1A1A2E"/>
           <w:sz w:val="22"/>
         </w:rPr>
-        <w:t>Sonuç olarak, AR Sağlık Projesi; doğru stratejik kararlarla, karaciğer nakli sonrası ilaç uyumluluğu sorununa yenilikçi ve etkili bir çözüm sunma potansiyeline sahip, umut vadeden bir dijital sağlık girişimidir.</w:t>
+        <w:t>Sonuç olarak Nefes Saati; doğru stratejik kararlarla, karaciğer nakli sonrası ilaç uyumluluğu sorununa yenilikçi, güvenilir ve kapsamlı bir çözüm sunma potansiyeline sahip, umut vadeden bir dijital sağlık girişimidir.</w:t>
       </w:r>
     </w:p>
     <w:p/>

</xml_diff>